<commit_message>
StrengthAndDignity Ch 9: drop redundant "high standard / the standard" line
Paul flagged the wordplay as not landing. The principle box right after
("If he cannot treat you with the dignity he would give his own sister,
he has already failed the test") already carries the weight that line
was trying to add.

Md source, docx, and HTML updated; reader PDF, EPUB, and Lulu Interior
all regenerated. Page counts unchanged (167 / 171).

Co-Authored-By: Claude Opus 4.7 (1M context) <noreply@anthropic.com>
</commit_message>
<xml_diff>
--- a/strength_and_dignity/StrengthAndDignity_Chapter9.docx
+++ b/strength_and_dignity/StrengthAndDignity_Chapter9.docx
@@ -169,15 +169,6 @@
           <w:i w:val="0"/>
         </w:rPr>
         <w:t>If a young man cannot treat you the way he would treat his own sister, he is not treating you the way Scripture commands.</w:t>
-      </w:r>
-    </w:p>
-    <w:p>
-      <w:r>
-        <w:rPr>
-          <w:b w:val="0"/>
-          <w:i w:val="0"/>
-        </w:rPr>
-        <w:t>That is a high standard. It is also the standard.</w:t>
       </w:r>
     </w:p>
     <w:p>

</xml_diff>